<commit_message>
audit: M3 interpretation fixes and regime-tracking caveat
All code and results reproduce exactly (notebooks, script, independent
recomputation of metrics, DeLong and CV AUC). Fixes are to interpretation:
- disclose that pooled CV AUC partly measures regime tracking (a year-level
  oracle scores 0.640); within-year AUC ranks KNN > LR > tree, as the test did
- shock persistence compared with ordinary weeks (4.2% vs 1.9%)
- fiscal-year odds ratio rests on five fiscal years; July concentration noted
- correct cost-ratio claims (20:1, and 2:1-3:1 vs Table 20)
- permutation leaders, utility-tariff significance, fuel-price takeaway
- Fig B4 legend, Fig B10 title, integer counts in metric CSVs
Manuscript rebuilt (3,296 body words, 12 pp) and PDF re-exported.
</commit_message>
<xml_diff>
--- a/manuscript/M3_manuscript_sections_IV_V.docx
+++ b/manuscript/M3_manuscript_sections_IV_V.docx
@@ -206,7 +206,7 @@
           <w:sz w:val="22"/>
           <w:szCs w:val="22"/>
         </w:rPr>
-        <w:t xml:space="preserve">The split is chronological and was fixed in Milestone 2, before any model was fitted. Training covers 270 weeks (1,350 rows) and the test period 91 weeks (455 rows), a 74.8/25.2 split by weeks. Shocks are the minority class: 17.2% of training rows and 7.7% of test rows (35 rows in 13 distinct weeks). Stratified random splitting, the usual remedy for imbalance, does not apply to a time series. It would train on later weeks to predict earlier ones, and it would separate the five quintile rows of a week, which share every week-level feature. Imbalance is handled instead by class weights (a tuned option), a cost-based alarm threshold (Section IV-E) and metrics that do not reward a model that never raises an alarm. The halving of the shock rate in the test period is a genuine prior shift caused by the 2025 disinflation [20], not a sampling artefact, and it makes the test harder for any alarm.</w:t>
+        <w:t xml:space="preserve">The split is chronological and was fixed in Milestone 2, before any model was fitted. Training covers 270 weeks (1,350 rows) and the test period 91 weeks (455 rows), a 74.8/25.2 split by weeks. Shocks are the minority class: 17.2% of training rows and 7.7% of test rows (35 rows in 13 distinct weeks). Stratified random splitting, the usual remedy for imbalance, does not apply to a time series. It would train on later weeks to predict earlier ones, and it would separate the five quintile rows of a week, which share every week-level feature. Imbalance is handled instead by class weights (a tuned option), a cost-based alarm threshold (Section IV-E) and metrics that do not reward a model that never raises an alarm. The halving of the shock rate in the test period is a genuine prior shift [20], caused by the 2025 disinflation and not by sampling, and it makes the test harder for any alarm.</w:t>
       </w:r>
     </w:p>
     <w:p>
@@ -3159,7 +3159,7 @@
           <w:sz w:val="22"/>
           <w:szCs w:val="22"/>
         </w:rPr>
-        <w:t xml:space="preserve"> (missed shock) leaves households to absorb a lasting price step without a buffer. For Q1, prices eight weeks after a shock week were a median 4.2% above the pre-shock week and fell back in only 16% of cases (training weeks). A typical Q1 shock (median 1.6%, mean 2.0%), applied to the Q1 expenditure ceiling of Rs 17,732 a month, costs up to Rs 355 a month, about 8% of the BISP Kafaalat stipend (Rs 13,500 a quarter since January 2025 [12]). Coping is often irreversible: smaller or cheaper meals, borrowing, asset sales. An evaluation of early action before Mongolia's 2017/18 dzud found about US$7 of avoided losses and added benefits per US$1 spent [11].</w:t>
+        <w:t xml:space="preserve"> (missed shock) leaves households to absorb a lasting price step without a buffer. For Q1 the step is not given back: eight weeks after a shock week, prices were a median 4.2% above the pre-shock week, against 1.9% over the same span around an ordinary week, and after the shock they kept rising at the usual pace (2.1% against 2.0% over eight weeks; training weeks). A typical Q1 shock (median 1.6%, mean 2.0%), applied to the Q1 expenditure ceiling of Rs 17,732 a month, costs up to Rs 355 a month, about 8% of the BISP Kafaalat stipend (Rs 13,500 a quarter since January 2025 [12]). Coping is often irreversible: smaller or cheaper meals, borrowing, asset sales. An evaluation of early action before Mongolia's 2017/18 dzud found about US$7 of avoided losses and added benefits per US$1 spent [11].</w:t>
       </w:r>
     </w:p>
     <w:p>
@@ -4025,7 +4025,7 @@
                 <w:sz w:val="18"/>
                 <w:szCs w:val="18"/>
               </w:rPr>
-              <w:t xml:space="preserve">median shock 1.6%; level 4.2% higher 8 weeks later; up to Rs 355 a month ≈ 8% of the stipend</w:t>
+              <w:t xml:space="preserve">median shock 1.6%, not reversed (4.2% above the pre-shock level 8 weeks later, against 1.9% for an ordinary week); up to Rs 355 a month ≈ 8% of the stipend</w:t>
             </w:r>
           </w:p>
         </w:tc>
@@ -4173,7 +4173,7 @@
           <w:sz w:val="22"/>
           <w:szCs w:val="22"/>
         </w:rPr>
-        <w:t xml:space="preserve">Table 17 and Fig. 8 summarise the tuning. All three learners beat both benchmarks: their pooled AUCs are 0.643 (logistic regression), 0.643 (KNN) and 0.652 (tree), against 0.584 for persistence and 0.467 for the majority class. The majority class falls below 0.5 because its constant prediction drifts with each fold's base rate, which is exactly the failure that the pooled criterion penalises. The validation curves show the bias–variance trade-off:</w:t>
+        <w:t xml:space="preserve">Table 17 and Fig. 8 summarise the tuning. On pooled AUC all three learners beat both benchmarks: 0.643 (logistic regression), 0.643 (KNN) and 0.652 (tree), against 0.584 for persistence and 0.467 for the majority class. The majority class falls below 0.5 because its constant prediction drifts with each fold's base rate, which is exactly the failure that the pooled criterion penalises. The validation curves show the bias–variance trade-off:</w:t>
       </w:r>
     </w:p>
     <w:p>
@@ -4340,7 +4340,22 @@
           <w:sz w:val="22"/>
           <w:szCs w:val="22"/>
         </w:rPr>
-        <w:t xml:space="preserve">, balanced class weights), although every C ≤ 0.01 scores within 0.013 of it. With a small, shifting sample, heavily shrunk weights, close to an "improper" linear model [21], generalise better than freely fitted ones. For KNN, z-score scaling beats Min-Max (0.64 against at most 0.53), because heavy tails let Min-Max compress ordinary weeks into a narrow band. The fold-to-fold standard deviations (0.05–0.08) are as large as the differences between learners, so the three learners are statistically indistinguishable in cross-validation.</w:t>
+        <w:t xml:space="preserve">, balanced class weights), although with balanced weights every C ≤ 0.01 scores within 0.013 of it. With a small, shifting sample, heavily shrunk weights, close to an "improper" linear model [21], generalise better than freely fitted ones. For KNN, z-score scaling beats Min-Max (0.64 against at most 0.53), because heavy tails let Min-Max compress ordinary weeks into a narrow band. The fold-to-fold standard deviations (0.05–0.08) are as large as the differences between learners, so the three learners are statistically indistinguishable in cross-validation.</w:t>
+      </w:r>
+    </w:p>
+    <w:p>
+      <w:pPr>
+        <w:spacing w:after="120" w:before="0" w:line="264"/>
+        <w:jc w:val="both"/>
+      </w:pPr>
+      <w:r>
+        <w:rPr>
+          <w:rFonts w:ascii="Times New Roman" w:cs="Times New Roman" w:eastAsia="Times New Roman" w:hAnsi="Times New Roman"/>
+          <w:color w:val="000000"/>
+          <w:sz w:val="22"/>
+          <w:szCs w:val="22"/>
+        </w:rPr>
+        <w:t xml:space="preserve">Pooled AUC also rewards tracking the regime. An oracle score equal to each validation year's realised shock rate, constant within the year, reaches 0.640. Ranking within years, the mean of the per-fold AUCs, orders the learners differently: KNN 0.672, logistic regression 0.651, tree 0.578, persistence 0.569. The tree leads the pooled ranking mainly because its first split recognises the 2022–23 crisis, and the within-year order is the one the test period reproduced (Section V-B). The selection rule was kept as planned, because changing it after seeing the test results would let them leak into model choice.</w:t>
       </w:r>
     </w:p>
     <w:p>
@@ -9129,7 +9144,7 @@
           <w:sz w:val="22"/>
           <w:szCs w:val="22"/>
         </w:rPr>
-        <w:t xml:space="preserve">The ranking skill survives (KNN's test cost would have fallen to about 0.89 of never alerting at thresholds between 0.15 and 0.22), but the threshold does not transfer across regimes. Re-choosing the threshold for each cost ratio does not rescue the baselines: they stay silent at 1 : 1 to 3 : 1, alert almost every week at 10 : 1, and at 20 : 1 merely match the cheapest trivial policy. The finding is therefore robust to the assumed ratio: an early warning calibrated on crisis years cries wolf in calm years.</w:t>
+        <w:t xml:space="preserve">The ranking skill survives (KNN's test cost would have fallen to about 0.89 of never alerting at thresholds between 0.15 and 0.23), but the threshold does not transfer across regimes. Re-choosing the threshold for each cost ratio does not rescue the baselines. They stay silent at 1 : 1. At 2 : 1 and 3 : 1 they still beat silence in 2021–24 but over-alert in 2025–26 (up to 2.01 times the cheaper trivial policy). At 10 : 1 they alert almost every week, and at 20 : 1 they merely match the cheapest trivial policy (always alert). The finding is therefore robust to the assumed ratio: an early warning calibrated on crisis years cries wolf in calm years.</w:t>
       </w:r>
     </w:p>
     <w:p>
@@ -11160,7 +11175,7 @@
           <w:sz w:val="22"/>
           <w:szCs w:val="22"/>
         </w:rPr>
-        <w:t xml:space="preserve">In addition, the strongest training signal never switched on: the rupee did not fall by more than 2% over eight weeks in any test week.</w:t>
+        <w:t xml:space="preserve">In addition, the strongest training signal never switched on: the rupee did not fall by more than 2% over eight weeks in any test week. July carried the most risk, beyond its first week: 4 of the 13 shock weeks fell in July, but only one of them was the week containing 1 July, the only week the fiscal-year flag marks.</w:t>
       </w:r>
     </w:p>
     <w:p>
@@ -14739,7 +14754,7 @@
           <w:sz w:val="22"/>
           <w:szCs w:val="22"/>
         </w:rPr>
-        <w:t xml:space="preserve">The three importance measures agree on the leading drivers (Fig. 12, Table 22). Rupee depreciation over eight weeks carries logistic regression's largest standardised weight and provides the tree's first split (above 8%; Gini importance 0.45). Recent shocks, staple-food inflation and perishables inflation rank high in at least two measures, and lead the permutation importance [18] computed on the validation folds. In an unpenalised logit with week-clustered errors, each 1% of depreciation raises the odds of a shock next week by 11% (odds ratio 1.11, </w:t>
+        <w:t xml:space="preserve">The three importance measures agree on the leading drivers (Fig. 12, Table 22). Rupee depreciation over eight weeks carries logistic regression's largest standardised weight and provides the tree's first split (above 8%; Gini importance 0.45). Recent shocks, staple-food inflation and perishables inflation rank high in at least two measures. Permutation importance [18], computed on the validation folds, is led by perishables inflation, recent shocks, the four-week SPI change and the rupee. In an unpenalised logit with week-clustered errors, each 1% of depreciation raises the odds of a shock next week by 11% (odds ratio 1.11, </w:t>
       </w:r>
       <w:r>
         <w:rPr>
@@ -14779,7 +14794,7 @@
           <w:sz w:val="22"/>
           <w:szCs w:val="22"/>
         </w:rPr>
-        <w:t xml:space="preserve"> = 0.013). The fiscal-year start matters greatly but rarely (2% of rows), so permutation importance barely registers it. Quintile dummies are near zero in every measure: once the signals are included, the groups do not differ in baseline shock risk.</w:t>
+        <w:t xml:space="preserve"> = 0.013). That estimate rests on only five fiscal-year starts (14 of their 25 quintile rows were followed by a shock), so its 95% interval is wide (1.4–19.5). The fiscal-year start matters greatly but rarely (2% of rows), so permutation importance barely registers it. Quintile dummies are near zero in every measure: once the signals are included, the groups do not differ in baseline shock risk.</w:t>
       </w:r>
     </w:p>
     <w:p>
@@ -16067,6 +16082,181 @@
                 <w:szCs w:val="18"/>
               </w:rPr>
               <w:t xml:space="preserve">0.001</w:t>
+            </w:r>
+          </w:p>
+        </w:tc>
+      </w:tr>
+      <w:tr>
+        <w:trPr>
+          <w:cantSplit/>
+        </w:trPr>
+        <w:tc>
+          <w:tcPr>
+            <w:tcW w:type="dxa" w:w="3300"/>
+            <w:tcBorders>
+              <w:top w:val="none" w:color="FFFFFF" w:sz="0"/>
+              <w:left w:val="none" w:color="FFFFFF" w:sz="0"/>
+              <w:bottom w:val="none" w:color="FFFFFF" w:sz="0"/>
+              <w:right w:val="none" w:color="FFFFFF" w:sz="0"/>
+            </w:tcBorders>
+            <w:tcMar>
+              <w:top w:type="dxa" w:w="30"/>
+              <w:left w:type="dxa" w:w="70"/>
+              <w:bottom w:type="dxa" w:w="30"/>
+              <w:right w:type="dxa" w:w="70"/>
+            </w:tcMar>
+            <w:vAlign w:val="center"/>
+          </w:tcPr>
+          <w:p>
+            <w:pPr>
+              <w:keepNext/>
+              <w:spacing w:after="0"/>
+              <w:jc w:val="left"/>
+            </w:pPr>
+            <w:r>
+              <w:rPr>
+                <w:rFonts w:ascii="Times New Roman" w:cs="Times New Roman" w:eastAsia="Times New Roman" w:hAnsi="Times New Roman"/>
+                <w:color w:val="000000"/>
+                <w:sz w:val="18"/>
+                <w:szCs w:val="18"/>
+              </w:rPr>
+              <w:t xml:space="preserve">Momentum-item spikes, 4 weeks (per spike)</w:t>
+            </w:r>
+          </w:p>
+        </w:tc>
+        <w:tc>
+          <w:tcPr>
+            <w:tcW w:type="dxa" w:w="1350"/>
+            <w:tcBorders>
+              <w:top w:val="none" w:color="FFFFFF" w:sz="0"/>
+              <w:left w:val="none" w:color="FFFFFF" w:sz="0"/>
+              <w:bottom w:val="none" w:color="FFFFFF" w:sz="0"/>
+              <w:right w:val="none" w:color="FFFFFF" w:sz="0"/>
+            </w:tcBorders>
+            <w:tcMar>
+              <w:top w:type="dxa" w:w="30"/>
+              <w:left w:type="dxa" w:w="70"/>
+              <w:bottom w:type="dxa" w:w="30"/>
+              <w:right w:type="dxa" w:w="70"/>
+            </w:tcMar>
+            <w:vAlign w:val="center"/>
+          </w:tcPr>
+          <w:p>
+            <w:pPr>
+              <w:keepNext/>
+              <w:spacing w:after="0"/>
+              <w:jc w:val="center"/>
+            </w:pPr>
+            <w:r>
+              <w:rPr>
+                <w:rFonts w:ascii="Times New Roman" w:cs="Times New Roman" w:eastAsia="Times New Roman" w:hAnsi="Times New Roman"/>
+                <w:color w:val="000000"/>
+                <w:sz w:val="18"/>
+                <w:szCs w:val="18"/>
+              </w:rPr>
+              <w:t xml:space="preserve">0.48</w:t>
+            </w:r>
+          </w:p>
+        </w:tc>
+        <w:tc>
+          <w:tcPr>
+            <w:tcW w:type="dxa" w:w="1700"/>
+            <w:tcBorders>
+              <w:top w:val="none" w:color="FFFFFF" w:sz="0"/>
+              <w:left w:val="none" w:color="FFFFFF" w:sz="0"/>
+              <w:bottom w:val="none" w:color="FFFFFF" w:sz="0"/>
+              <w:right w:val="none" w:color="FFFFFF" w:sz="0"/>
+            </w:tcBorders>
+            <w:tcMar>
+              <w:top w:type="dxa" w:w="30"/>
+              <w:left w:type="dxa" w:w="70"/>
+              <w:bottom w:type="dxa" w:w="30"/>
+              <w:right w:type="dxa" w:w="70"/>
+            </w:tcMar>
+            <w:vAlign w:val="center"/>
+          </w:tcPr>
+          <w:p>
+            <w:pPr>
+              <w:keepNext/>
+              <w:spacing w:after="0"/>
+              <w:jc w:val="center"/>
+            </w:pPr>
+            <w:r>
+              <w:rPr>
+                <w:rFonts w:ascii="Times New Roman" w:cs="Times New Roman" w:eastAsia="Times New Roman" w:hAnsi="Times New Roman"/>
+                <w:color w:val="000000"/>
+                <w:sz w:val="18"/>
+                <w:szCs w:val="18"/>
+              </w:rPr>
+              <w:t xml:space="preserve">0.92 (0.463)</w:t>
+            </w:r>
+          </w:p>
+        </w:tc>
+        <w:tc>
+          <w:tcPr>
+            <w:tcW w:type="dxa" w:w="1150"/>
+            <w:tcBorders>
+              <w:top w:val="none" w:color="FFFFFF" w:sz="0"/>
+              <w:left w:val="none" w:color="FFFFFF" w:sz="0"/>
+              <w:bottom w:val="none" w:color="FFFFFF" w:sz="0"/>
+              <w:right w:val="none" w:color="FFFFFF" w:sz="0"/>
+            </w:tcBorders>
+            <w:tcMar>
+              <w:top w:type="dxa" w:w="30"/>
+              <w:left w:type="dxa" w:w="70"/>
+              <w:bottom w:type="dxa" w:w="30"/>
+              <w:right w:type="dxa" w:w="70"/>
+            </w:tcMar>
+            <w:vAlign w:val="center"/>
+          </w:tcPr>
+          <w:p>
+            <w:pPr>
+              <w:keepNext/>
+              <w:spacing w:after="0"/>
+              <w:jc w:val="center"/>
+            </w:pPr>
+            <w:r>
+              <w:rPr>
+                <w:rFonts w:ascii="Times New Roman" w:cs="Times New Roman" w:eastAsia="Times New Roman" w:hAnsi="Times New Roman"/>
+                <w:color w:val="000000"/>
+                <w:sz w:val="18"/>
+                <w:szCs w:val="18"/>
+              </w:rPr>
+              <w:t xml:space="preserve">0.00</w:t>
+            </w:r>
+          </w:p>
+        </w:tc>
+        <w:tc>
+          <w:tcPr>
+            <w:tcW w:type="dxa" w:w="1526"/>
+            <w:tcBorders>
+              <w:top w:val="none" w:color="FFFFFF" w:sz="0"/>
+              <w:left w:val="none" w:color="FFFFFF" w:sz="0"/>
+              <w:bottom w:val="none" w:color="FFFFFF" w:sz="0"/>
+              <w:right w:val="none" w:color="FFFFFF" w:sz="0"/>
+            </w:tcBorders>
+            <w:tcMar>
+              <w:top w:type="dxa" w:w="30"/>
+              <w:left w:type="dxa" w:w="70"/>
+              <w:bottom w:type="dxa" w:w="30"/>
+              <w:right w:type="dxa" w:w="70"/>
+            </w:tcMar>
+            <w:vAlign w:val="center"/>
+          </w:tcPr>
+          <w:p>
+            <w:pPr>
+              <w:keepNext/>
+              <w:spacing w:after="0"/>
+              <w:jc w:val="center"/>
+            </w:pPr>
+            <w:r>
+              <w:rPr>
+                <w:rFonts w:ascii="Times New Roman" w:cs="Times New Roman" w:eastAsia="Times New Roman" w:hAnsi="Times New Roman"/>
+                <w:color w:val="000000"/>
+                <w:sz w:val="18"/>
+                <w:szCs w:val="18"/>
+              </w:rPr>
+              <w:t xml:space="preserve">0.005</w:t>
             </w:r>
           </w:p>
         </w:tc>
@@ -17077,7 +17267,7 @@
           <w:sz w:val="22"/>
           <w:szCs w:val="22"/>
         </w:rPr>
-        <w:t xml:space="preserve">Utility tariffs</w:t>
+        <w:t xml:space="preserve">Perishables</w:t>
       </w:r>
       <w:r>
         <w:rPr>
@@ -17106,7 +17296,7 @@
           <w:sz w:val="22"/>
           <w:szCs w:val="22"/>
         </w:rPr>
-        <w:t xml:space="preserve"> = 0.10) and </w:t>
+        <w:t xml:space="preserve"> &lt; 0.001) hit the poorest harder. </w:t>
       </w:r>
       <w:r>
         <w:rPr>
@@ -17117,7 +17307,7 @@
           <w:sz w:val="22"/>
           <w:szCs w:val="22"/>
         </w:rPr>
-        <w:t xml:space="preserve">perishables</w:t>
+        <w:t xml:space="preserve">Utility tariffs</w:t>
       </w:r>
       <w:r>
         <w:rPr>
@@ -17126,7 +17316,7 @@
           <w:sz w:val="22"/>
           <w:szCs w:val="22"/>
         </w:rPr>
-        <w:t xml:space="preserve"> (+0.03, </w:t>
+        <w:t xml:space="preserve"> point the same way (+0.03) but are not significant (</w:t>
       </w:r>
       <w:r>
         <w:rPr>
@@ -17146,7 +17336,7 @@
           <w:sz w:val="22"/>
           <w:szCs w:val="22"/>
         </w:rPr>
-        <w:t xml:space="preserve"> &lt; 0.001) hit the poorest harder.</w:t>
+        <w:t xml:space="preserve"> = 0.10).</w:t>
       </w:r>
     </w:p>
     <w:p>
@@ -17180,7 +17370,7 @@
           <w:sz w:val="22"/>
           <w:szCs w:val="22"/>
         </w:rPr>
-        <w:t xml:space="preserve"> from 0.16 to 0.38. The burden therefore rotates between motor-fuel shocks and food and utility-tariff shocks, and the latter are exactly the shocks the baselines miss. Because the split was chosen after seeing the H3 result, it is a hypothesis for Milestone 4 rather than a confirmed finding.</w:t>
+        <w:t xml:space="preserve"> from 0.16 to 0.38. The burden therefore rotates between motor-fuel shocks, heavier on the rich, and food shocks, heavier on the poor, with utility tariffs probably on the poor side. Perishable and tariff shocks are also the ones the baselines miss. Because the split was chosen after seeing the H3 result, it is a hypothesis for Milestone 4 rather than a confirmed finding.</w:t>
       </w:r>
     </w:p>
     <w:p>
@@ -18553,7 +18743,7 @@
           <w:sz w:val="22"/>
           <w:szCs w:val="22"/>
         </w:rPr>
-        <w:t xml:space="preserve"> The fiscal-year start (budget, taxes, tariff rebasing) multiplies the odds of a shock about five-fold. Paying a Kafaalat instalment before it rather than after is a low-cost response.</w:t>
+        <w:t xml:space="preserve"> The fiscal-year start (budget, taxes, tariff rebasing) multiplied the odds of a shock about five-fold in 2019–24, an estimate from only five fiscal years. In 2025–26, 4 of the 13 shock weeks fell in July, mostly after its first week. Paying a Kafaalat instalment before July rather than after is a low-cost response.</w:t>
       </w:r>
     </w:p>
     <w:p>
@@ -18584,7 +18774,7 @@
           <w:sz w:val="22"/>
           <w:szCs w:val="22"/>
         </w:rPr>
-        <w:t xml:space="preserve"> Utility tariffs and fuel prices are set by NEPRA, OGRA and the Economic Coordination Committee. They drive the shocks that hit the poorest hardest, and no market signal anticipates them. Advance notice from these bodies to the social-protection agency would be a cheaper early warning than any model.</w:t>
+        <w:t xml:space="preserve"> Utility tariffs and fuel prices are set by NEPRA, OGRA and the Economic Coordination Committee. They drove 6 of the 13 test shock weeks, and no market signal anticipates them. Advance notice from these bodies to the social-protection agency would be a cheaper early warning than any model.</w:t>
       </w:r>
     </w:p>
     <w:p>
@@ -18639,7 +18829,7 @@
           <w:sz w:val="22"/>
           <w:szCs w:val="22"/>
         </w:rPr>
-        <w:t xml:space="preserve">The baselines have six main limitations:</w:t>
+        <w:t xml:space="preserve">The baselines have seven main limitations:</w:t>
       </w:r>
     </w:p>
     <w:p>
@@ -18723,7 +18913,7 @@
           <w:sz w:val="22"/>
           <w:szCs w:val="22"/>
         </w:rPr>
-        <w:t xml:space="preserve">A small test set:</w:t>
+        <w:t xml:space="preserve">Selection criterion:</w:t>
       </w:r>
       <w:r>
         <w:rPr>
@@ -18732,7 +18922,7 @@
           <w:sz w:val="22"/>
           <w:szCs w:val="22"/>
         </w:rPr>
-        <w:t xml:space="preserve"> only 13 distinct shock weeks, so the test metrics are imprecise.</w:t>
+        <w:t xml:space="preserve"> pooled AUC partly rewards telling crisis years from calm ones, which flattered the tree.</w:t>
       </w:r>
     </w:p>
     <w:p>
@@ -18754,7 +18944,7 @@
           <w:sz w:val="22"/>
           <w:szCs w:val="22"/>
         </w:rPr>
-        <w:t xml:space="preserve">Missing information:</w:t>
+        <w:t xml:space="preserve">A small test set:</w:t>
       </w:r>
       <w:r>
         <w:rPr>
@@ -18763,7 +18953,7 @@
           <w:sz w:val="22"/>
           <w:szCs w:val="22"/>
         </w:rPr>
-        <w:t xml:space="preserve"> there is no lead information on tariff decisions or supply shocks.</w:t>
+        <w:t xml:space="preserve"> only 13 distinct shock weeks, so the test metrics are imprecise.</w:t>
       </w:r>
     </w:p>
     <w:p>
@@ -18785,7 +18975,7 @@
           <w:sz w:val="22"/>
           <w:szCs w:val="22"/>
         </w:rPr>
-        <w:t xml:space="preserve">Potential bias:</w:t>
+        <w:t xml:space="preserve">Missing information:</w:t>
       </w:r>
       <w:r>
         <w:rPr>
@@ -18794,7 +18984,7 @@
           <w:sz w:val="22"/>
           <w:szCs w:val="22"/>
         </w:rPr>
-        <w:t xml:space="preserve"> the SPI covers 17 cities only, so rural poor households are invisible; quintiles rest on 2015-16 expenditure weights; and a pooled model may serve the poorest worst, as the low Q1 recall of two learners hints.</w:t>
+        <w:t xml:space="preserve"> there is no lead information on tariff decisions or supply shocks.</w:t>
       </w:r>
     </w:p>
     <w:p>
@@ -18816,7 +19006,7 @@
           <w:sz w:val="22"/>
           <w:szCs w:val="22"/>
         </w:rPr>
-        <w:t xml:space="preserve">Data vintage:</w:t>
+        <w:t xml:space="preserve">Potential bias:</w:t>
       </w:r>
       <w:r>
         <w:rPr>
@@ -18825,22 +19015,7 @@
           <w:sz w:val="22"/>
           <w:szCs w:val="22"/>
         </w:rPr>
-        <w:t xml:space="preserve"> revised SPI values are used, whereas a real-time forecaster would see first releases.</w:t>
-      </w:r>
-    </w:p>
-    <w:p>
-      <w:pPr>
-        <w:spacing w:after="120" w:before="0" w:line="264"/>
-        <w:jc w:val="both"/>
-      </w:pPr>
-      <w:r>
-        <w:rPr>
-          <w:rFonts w:ascii="Times New Roman" w:cs="Times New Roman" w:eastAsia="Times New Roman" w:hAnsi="Times New Roman"/>
-          <w:color w:val="000000"/>
-          <w:sz w:val="22"/>
-          <w:szCs w:val="22"/>
-        </w:rPr>
-        <w:t xml:space="preserve">Milestone 4 will address these limitations in five steps:</w:t>
+        <w:t xml:space="preserve"> the SPI covers 17 cities only, so rural poor households are invisible; quintiles rest on 2015-16 expenditure weights; and a pooled model may serve the poorest worst, as the low Q1 recall of two learners hints.</w:t>
       </w:r>
     </w:p>
     <w:p>
@@ -18862,7 +19037,7 @@
           <w:sz w:val="22"/>
           <w:szCs w:val="22"/>
         </w:rPr>
-        <w:t xml:space="preserve">Ensembles:</w:t>
+        <w:t xml:space="preserve">Data vintage:</w:t>
       </w:r>
       <w:r>
         <w:rPr>
@@ -18871,7 +19046,22 @@
           <w:sz w:val="22"/>
           <w:szCs w:val="22"/>
         </w:rPr>
-        <w:t xml:space="preserve"> add random forests and gradient boosting under the same validation, selection and threshold protocol, and test quintile-specific against pooled models with signal × quintile interactions (H4).</w:t>
+        <w:t xml:space="preserve"> revised SPI values are used, whereas a real-time forecaster would see first releases.</w:t>
+      </w:r>
+    </w:p>
+    <w:p>
+      <w:pPr>
+        <w:spacing w:after="120" w:before="0" w:line="264"/>
+        <w:jc w:val="both"/>
+      </w:pPr>
+      <w:r>
+        <w:rPr>
+          <w:rFonts w:ascii="Times New Roman" w:cs="Times New Roman" w:eastAsia="Times New Roman" w:hAnsi="Times New Roman"/>
+          <w:color w:val="000000"/>
+          <w:sz w:val="22"/>
+          <w:szCs w:val="22"/>
+        </w:rPr>
+        <w:t xml:space="preserve">Milestone 4 will address these limitations in five steps:</w:t>
       </w:r>
     </w:p>
     <w:p>
@@ -18893,7 +19083,7 @@
           <w:sz w:val="22"/>
           <w:szCs w:val="22"/>
         </w:rPr>
-        <w:t xml:space="preserve">Calibration:</w:t>
+        <w:t xml:space="preserve">Ensembles:</w:t>
       </w:r>
       <w:r>
         <w:rPr>
@@ -18902,7 +19092,7 @@
           <w:sz w:val="22"/>
           <w:szCs w:val="22"/>
         </w:rPr>
-        <w:t xml:space="preserve"> calibrate probabilities (Platt, isotonic) and report their reliability.</w:t>
+        <w:t xml:space="preserve"> add random forests and gradient boosting under the same validation, selection and threshold protocol, and test quintile-specific against pooled models with signal × quintile interactions (H4).</w:t>
       </w:r>
     </w:p>
     <w:p>
@@ -18924,7 +19114,7 @@
           <w:sz w:val="22"/>
           <w:szCs w:val="22"/>
         </w:rPr>
-        <w:t xml:space="preserve">New features:</w:t>
+        <w:t xml:space="preserve">Calibration and selection:</w:t>
       </w:r>
       <w:r>
         <w:rPr>
@@ -18933,7 +19123,38 @@
           <w:sz w:val="22"/>
           <w:szCs w:val="22"/>
         </w:rPr>
-        <w:t xml:space="preserve"> add an administered-price calendar (NEPRA and OGRA notification dates) and a regime feature (rolling shock rate).</w:t>
+        <w:t xml:space="preserve"> calibrate probabilities (Platt, isotonic), report their reliability, and report within-year AUC alongside pooled AUC.</w:t>
+      </w:r>
+    </w:p>
+    <w:p>
+      <w:pPr>
+        <w:pStyle w:val="ListParagraph"/>
+        <w:numPr>
+          <w:ilvl w:val="0"/>
+          <w:numId w:val="2"/>
+        </w:numPr>
+        <w:spacing w:after="60" w:line="264"/>
+        <w:jc w:val="both"/>
+      </w:pPr>
+      <w:r>
+        <w:rPr>
+          <w:rFonts w:ascii="Times New Roman" w:cs="Times New Roman" w:eastAsia="Times New Roman" w:hAnsi="Times New Roman"/>
+          <w:b/>
+          <w:bCs/>
+          <w:color w:val="000000"/>
+          <w:sz w:val="22"/>
+          <w:szCs w:val="22"/>
+        </w:rPr>
+        <w:t xml:space="preserve">New features:</w:t>
+      </w:r>
+      <w:r>
+        <w:rPr>
+          <w:rFonts w:ascii="Times New Roman" w:cs="Times New Roman" w:eastAsia="Times New Roman" w:hAnsi="Times New Roman"/>
+          <w:color w:val="000000"/>
+          <w:sz w:val="22"/>
+          <w:szCs w:val="22"/>
+        </w:rPr>
+        <w:t xml:space="preserve"> add an administered-price calendar (NEPRA and OGRA notification dates), a first-month-of-the-fiscal-year window and a regime feature (rolling shock rate).</w:t>
       </w:r>
     </w:p>
     <w:p>

</xml_diff>

<commit_message>
M3: team review fixes to notebooks and report
- Notebook 03: check of C below the grid (plateau, C unchanged); paired
  bootstrap of KNN's test AUC against the other models, replacing
  "KNN generalised best"; top-5 drivers table with policy implications;
  pointer from the split notes to the shuffled stratified K-fold check.
- Notebook 04: retitled as supporting analysis; caveat that the Q1-Q5
  gap is built from basket weights, so H3 coefficients are descriptive.
- Manuscript: same wording, plateau sentence, H3 caveat and the top-5
  table (Table 24); PDF re-exported (13 pages).
- Viva guide builder updated to match.
Both notebooks re-run cleanly; all existing outputs are byte-identical,
and train_baselines.py reproduces them exactly.
</commit_message>
<xml_diff>
--- a/manuscript/M3_manuscript_sections_IV_V.docx
+++ b/manuscript/M3_manuscript_sections_IV_V.docx
@@ -4230,7 +4230,45 @@
           <w:sz w:val="22"/>
           <w:szCs w:val="22"/>
         </w:rPr>
-        <w:t xml:space="preserve">, balanced class weights), although with balanced weights every C ≤ 0.01 scores within 0.013 of it. With a small sample that shifts over time, heavily shrunk weights generalise better than freely fitted ones. For KNN, z-score scaling beats Min-Max (0.64 against at most 0.53), because heavy tails let Min-Max compress ordinary weeks into a narrow band. The fold-to-fold standard deviations (0.05–0.08) are as large as the differences between learners, so the three learners are statistically indistinguishable in cross-validation.</w:t>
+        <w:t xml:space="preserve">, balanced class weights), although with balanced weights every C ≤ 0.01 scores within 0.013 of it. Because this is the edge of the grid, we also tried C = 3 × 10</w:t>
+      </w:r>
+      <w:r>
+        <w:rPr>
+          <w:rFonts w:ascii="Times New Roman" w:cs="Times New Roman" w:eastAsia="Times New Roman" w:hAnsi="Times New Roman"/>
+          <w:color w:val="000000"/>
+          <w:sz w:val="22"/>
+          <w:szCs w:val="22"/>
+          <w:vertAlign w:val="superscript"/>
+        </w:rPr>
+        <w:t xml:space="preserve">−5</w:t>
+      </w:r>
+      <w:r>
+        <w:rPr>
+          <w:rFonts w:ascii="Times New Roman" w:cs="Times New Roman" w:eastAsia="Times New Roman" w:hAnsi="Times New Roman"/>
+          <w:color w:val="000000"/>
+          <w:sz w:val="22"/>
+          <w:szCs w:val="22"/>
+        </w:rPr>
+        <w:t xml:space="preserve"> and 10</w:t>
+      </w:r>
+      <w:r>
+        <w:rPr>
+          <w:rFonts w:ascii="Times New Roman" w:cs="Times New Roman" w:eastAsia="Times New Roman" w:hAnsi="Times New Roman"/>
+          <w:color w:val="000000"/>
+          <w:sz w:val="22"/>
+          <w:szCs w:val="22"/>
+          <w:vertAlign w:val="superscript"/>
+        </w:rPr>
+        <w:t xml:space="preserve">−5</w:t>
+      </w:r>
+      <w:r>
+        <w:rPr>
+          <w:rFonts w:ascii="Times New Roman" w:cs="Times New Roman" w:eastAsia="Times New Roman" w:hAnsi="Times New Roman"/>
+          <w:color w:val="000000"/>
+          <w:sz w:val="22"/>
+          <w:szCs w:val="22"/>
+        </w:rPr>
+        <w:t xml:space="preserve">: both the pooled and the within-year AUC change by at most 0.001, so the selected value sits on a plateau rather than short of a better one. With a small sample that shifts over time, heavily shrunk weights generalise better than freely fitted ones. For KNN, z-score scaling beats Min-Max (0.64 against at most 0.53), because heavy tails let Min-Max compress ordinary weeks into a narrow band. The fold-to-fold standard deviations (0.05–0.08) are as large as the differences between learners, so the three learners are statistically indistinguishable in cross-validation.</w:t>
       </w:r>
     </w:p>
     <w:p>
@@ -6729,7 +6767,7 @@
           <w:sz w:val="22"/>
           <w:szCs w:val="22"/>
         </w:rPr>
-        <w:t xml:space="preserve">Table 19 reports the single evaluation on 2025–26. The majority class has the highest accuracy (92.3%) while catching no shock, which is why accuracy cannot be used to select an alarm model. KNN generalised best, with a ROC-AUC of 0.68 (95% interval 0.47–0.83) and a recall of 0.57 (20 of 35 shock rows) at a specificity of 0.68. Logistic regression (AUC 0.57) and the tree (0.54) ranked shocks only slightly better than chance, and persistence (0.47) not at all, because shocks did not cluster in 2025–26 (Fig. 9).</w:t>
+        <w:t xml:space="preserve">Table 19 reports the single evaluation on 2025–26. The majority class has the highest accuracy (92.3%) while catching no shock, which is why accuracy cannot be used to select an alarm model. KNN had the highest ROC-AUC, 0.68 (95% interval 0.47–0.83), and a recall of 0.57 (20 of 35 shock rows) at a specificity of 0.68. Compared on the same resampled weeks, it ranked shocks better than logistic regression (difference +0.11, 95% interval +0.02 to +0.22) but not clearly better than the tree (+0.14, −0.04 to +0.29); with only 13 shock weeks, we do not call it the best model. Logistic regression (AUC 0.57) and the tree (0.54) ranked shocks only slightly better than chance, and persistence (0.47) not at all, because shocks did not cluster in 2025–26 (Fig. 9).</w:t>
       </w:r>
     </w:p>
     <w:p>
@@ -17260,7 +17298,7 @@
           <w:sz w:val="22"/>
           <w:szCs w:val="22"/>
         </w:rPr>
-        <w:t xml:space="preserve"> from 0.16 to 0.38. The burden therefore rotates between motor-fuel shocks, heavier on the rich, and food shocks, heavier on the poor, with utility tariffs probably on the poor side. Perishable and tariff shocks are also the ones the baselines miss. Because the split was chosen after seeing the H3 result, it is a hypothesis for Milestone 4 rather than a confirmed finding.</w:t>
+        <w:t xml:space="preserve"> from 0.16 to 0.38. The burden therefore rotates between motor-fuel shocks, heavier on the rich, and food shocks, heavier on the poor, with utility tariffs probably on the poor side. Perishable and tariff shocks are also the ones the baselines miss. Because the split was chosen after seeing the H3 result, it is a hypothesis for Milestone 4 rather than a confirmed finding. The gap is also partly mechanical: it is built from the same item price changes, weighted by each quintile's basket (food is about 57% of Q1's estimated basket against 43% of Q5's), so these regressions partly recover known weight differences. Their coefficients are descriptive, not causal.</w:t>
       </w:r>
     </w:p>
     <w:p>
@@ -18572,6 +18610,938 @@
       </w:pPr>
       <w:r>
         <w:t xml:space="preserve">G. Initial Policy Takeaways</w:t>
+      </w:r>
+    </w:p>
+    <w:p>
+      <w:pPr>
+        <w:spacing w:after="120" w:before="0" w:line="264"/>
+        <w:jc w:val="both"/>
+      </w:pPr>
+      <w:r>
+        <w:rPr>
+          <w:rFonts w:ascii="Times New Roman" w:cs="Times New Roman" w:eastAsia="Times New Roman" w:hAnsi="Times New Roman"/>
+          <w:color w:val="000000"/>
+          <w:sz w:val="22"/>
+          <w:szCs w:val="22"/>
+        </w:rPr>
+        <w:t xml:space="preserve">Table 24 links each of the five leading drivers, ranked by mean permutation importance, to a policy implication. Importance shows what the models rely on, not cause and effect, so these are directions for monitoring rather than proven levers.</w:t>
+      </w:r>
+    </w:p>
+    <w:p>
+      <w:pPr>
+        <w:keepNext/>
+        <w:spacing w:after="80" w:before="160"/>
+        <w:jc w:val="left"/>
+      </w:pPr>
+      <w:r>
+        <w:rPr>
+          <w:rFonts w:ascii="Times New Roman" w:cs="Times New Roman" w:eastAsia="Times New Roman" w:hAnsi="Times New Roman"/>
+          <w:b/>
+          <w:bCs/>
+          <w:sz w:val="19"/>
+          <w:szCs w:val="19"/>
+        </w:rPr>
+        <w:t xml:space="preserve">Table 24. </w:t>
+      </w:r>
+      <w:r>
+        <w:rPr>
+          <w:rFonts w:ascii="Times New Roman" w:cs="Times New Roman" w:eastAsia="Times New Roman" w:hAnsi="Times New Roman"/>
+          <w:color w:val="000000"/>
+          <w:sz w:val="19"/>
+          <w:szCs w:val="19"/>
+        </w:rPr>
+        <w:t xml:space="preserve">The five leading drivers and their policy implications.</w:t>
+      </w:r>
+    </w:p>
+    <w:tbl>
+      <w:tblPr>
+        <w:tblW w:type="dxa" w:w="9026"/>
+        <w:jc w:val="center"/>
+        <w:tblBorders>
+          <w:top w:val="none" w:color="FFFFFF" w:sz="0"/>
+          <w:left w:val="none" w:color="FFFFFF" w:sz="0"/>
+          <w:bottom w:val="none" w:color="FFFFFF" w:sz="0"/>
+          <w:right w:val="none" w:color="FFFFFF" w:sz="0"/>
+          <w:insideH w:val="none" w:color="FFFFFF" w:sz="0"/>
+          <w:insideV w:val="none" w:color="FFFFFF" w:sz="0"/>
+        </w:tblBorders>
+        <w:tblLayout w:type="fixed"/>
+      </w:tblPr>
+      <w:tblGrid>
+        <w:gridCol w:w="700"/>
+        <w:gridCol w:w="2600"/>
+        <w:gridCol w:w="1300"/>
+        <w:gridCol w:w="4426"/>
+      </w:tblGrid>
+      <w:tr>
+        <w:trPr>
+          <w:cantSplit/>
+          <w:tblHeader/>
+        </w:trPr>
+        <w:tc>
+          <w:tcPr>
+            <w:tcW w:type="dxa" w:w="700"/>
+            <w:tcBorders>
+              <w:top w:val="single" w:color="000000" w:sz="12"/>
+              <w:left w:val="none" w:color="FFFFFF" w:sz="0"/>
+              <w:bottom w:val="single" w:color="000000" w:sz="6"/>
+              <w:right w:val="none" w:color="FFFFFF" w:sz="0"/>
+            </w:tcBorders>
+            <w:tcMar>
+              <w:top w:type="dxa" w:w="30"/>
+              <w:left w:type="dxa" w:w="70"/>
+              <w:bottom w:type="dxa" w:w="30"/>
+              <w:right w:type="dxa" w:w="70"/>
+            </w:tcMar>
+            <w:vAlign w:val="center"/>
+          </w:tcPr>
+          <w:p>
+            <w:pPr>
+              <w:keepNext/>
+              <w:spacing w:after="0"/>
+              <w:jc w:val="center"/>
+            </w:pPr>
+            <w:r>
+              <w:rPr>
+                <w:rFonts w:ascii="Times New Roman" w:cs="Times New Roman" w:eastAsia="Times New Roman" w:hAnsi="Times New Roman"/>
+                <w:b/>
+                <w:bCs/>
+                <w:color w:val="000000"/>
+                <w:sz w:val="18"/>
+                <w:szCs w:val="18"/>
+              </w:rPr>
+              <w:t xml:space="preserve">Rank</w:t>
+            </w:r>
+          </w:p>
+        </w:tc>
+        <w:tc>
+          <w:tcPr>
+            <w:tcW w:type="dxa" w:w="2600"/>
+            <w:tcBorders>
+              <w:top w:val="single" w:color="000000" w:sz="12"/>
+              <w:left w:val="none" w:color="FFFFFF" w:sz="0"/>
+              <w:bottom w:val="single" w:color="000000" w:sz="6"/>
+              <w:right w:val="none" w:color="FFFFFF" w:sz="0"/>
+            </w:tcBorders>
+            <w:tcMar>
+              <w:top w:type="dxa" w:w="30"/>
+              <w:left w:type="dxa" w:w="70"/>
+              <w:bottom w:type="dxa" w:w="30"/>
+              <w:right w:type="dxa" w:w="70"/>
+            </w:tcMar>
+            <w:vAlign w:val="center"/>
+          </w:tcPr>
+          <w:p>
+            <w:pPr>
+              <w:keepNext/>
+              <w:spacing w:after="0"/>
+              <w:jc w:val="left"/>
+            </w:pPr>
+            <w:r>
+              <w:rPr>
+                <w:rFonts w:ascii="Times New Roman" w:cs="Times New Roman" w:eastAsia="Times New Roman" w:hAnsi="Times New Roman"/>
+                <w:b/>
+                <w:bCs/>
+                <w:color w:val="000000"/>
+                <w:sz w:val="18"/>
+                <w:szCs w:val="18"/>
+              </w:rPr>
+              <w:t xml:space="preserve">Driver</w:t>
+            </w:r>
+          </w:p>
+        </w:tc>
+        <w:tc>
+          <w:tcPr>
+            <w:tcW w:type="dxa" w:w="1300"/>
+            <w:tcBorders>
+              <w:top w:val="single" w:color="000000" w:sz="12"/>
+              <w:left w:val="none" w:color="FFFFFF" w:sz="0"/>
+              <w:bottom w:val="single" w:color="000000" w:sz="6"/>
+              <w:right w:val="none" w:color="FFFFFF" w:sz="0"/>
+            </w:tcBorders>
+            <w:tcMar>
+              <w:top w:type="dxa" w:w="30"/>
+              <w:left w:type="dxa" w:w="70"/>
+              <w:bottom w:type="dxa" w:w="30"/>
+              <w:right w:type="dxa" w:w="70"/>
+            </w:tcMar>
+            <w:vAlign w:val="center"/>
+          </w:tcPr>
+          <w:p>
+            <w:pPr>
+              <w:keepNext/>
+              <w:spacing w:after="0"/>
+              <w:jc w:val="center"/>
+            </w:pPr>
+            <w:r>
+              <w:rPr>
+                <w:rFonts w:ascii="Times New Roman" w:cs="Times New Roman" w:eastAsia="Times New Roman" w:hAnsi="Times New Roman"/>
+                <w:b/>
+                <w:bCs/>
+                <w:color w:val="000000"/>
+                <w:sz w:val="18"/>
+                <w:szCs w:val="18"/>
+              </w:rPr>
+              <w:t xml:space="preserve">Permutation ΔAUC</w:t>
+            </w:r>
+          </w:p>
+        </w:tc>
+        <w:tc>
+          <w:tcPr>
+            <w:tcW w:type="dxa" w:w="4426"/>
+            <w:tcBorders>
+              <w:top w:val="single" w:color="000000" w:sz="12"/>
+              <w:left w:val="none" w:color="FFFFFF" w:sz="0"/>
+              <w:bottom w:val="single" w:color="000000" w:sz="6"/>
+              <w:right w:val="none" w:color="FFFFFF" w:sz="0"/>
+            </w:tcBorders>
+            <w:tcMar>
+              <w:top w:type="dxa" w:w="30"/>
+              <w:left w:type="dxa" w:w="70"/>
+              <w:bottom w:type="dxa" w:w="30"/>
+              <w:right w:type="dxa" w:w="70"/>
+            </w:tcMar>
+            <w:vAlign w:val="center"/>
+          </w:tcPr>
+          <w:p>
+            <w:pPr>
+              <w:keepNext/>
+              <w:spacing w:after="0"/>
+              <w:jc w:val="left"/>
+            </w:pPr>
+            <w:r>
+              <w:rPr>
+                <w:rFonts w:ascii="Times New Roman" w:cs="Times New Roman" w:eastAsia="Times New Roman" w:hAnsi="Times New Roman"/>
+                <w:b/>
+                <w:bCs/>
+                <w:color w:val="000000"/>
+                <w:sz w:val="18"/>
+                <w:szCs w:val="18"/>
+              </w:rPr>
+              <w:t xml:space="preserve">Policy implication</w:t>
+            </w:r>
+          </w:p>
+        </w:tc>
+      </w:tr>
+      <w:tr>
+        <w:trPr>
+          <w:cantSplit/>
+        </w:trPr>
+        <w:tc>
+          <w:tcPr>
+            <w:tcW w:type="dxa" w:w="700"/>
+            <w:tcBorders>
+              <w:top w:val="none" w:color="FFFFFF" w:sz="0"/>
+              <w:left w:val="none" w:color="FFFFFF" w:sz="0"/>
+              <w:bottom w:val="none" w:color="FFFFFF" w:sz="0"/>
+              <w:right w:val="none" w:color="FFFFFF" w:sz="0"/>
+            </w:tcBorders>
+            <w:tcMar>
+              <w:top w:type="dxa" w:w="30"/>
+              <w:left w:type="dxa" w:w="70"/>
+              <w:bottom w:type="dxa" w:w="30"/>
+              <w:right w:type="dxa" w:w="70"/>
+            </w:tcMar>
+            <w:vAlign w:val="center"/>
+          </w:tcPr>
+          <w:p>
+            <w:pPr>
+              <w:keepNext/>
+              <w:spacing w:after="0"/>
+              <w:jc w:val="center"/>
+            </w:pPr>
+            <w:r>
+              <w:rPr>
+                <w:rFonts w:ascii="Times New Roman" w:cs="Times New Roman" w:eastAsia="Times New Roman" w:hAnsi="Times New Roman"/>
+                <w:color w:val="000000"/>
+                <w:sz w:val="18"/>
+                <w:szCs w:val="18"/>
+              </w:rPr>
+              <w:t xml:space="preserve">1</w:t>
+            </w:r>
+          </w:p>
+        </w:tc>
+        <w:tc>
+          <w:tcPr>
+            <w:tcW w:type="dxa" w:w="2600"/>
+            <w:tcBorders>
+              <w:top w:val="none" w:color="FFFFFF" w:sz="0"/>
+              <w:left w:val="none" w:color="FFFFFF" w:sz="0"/>
+              <w:bottom w:val="none" w:color="FFFFFF" w:sz="0"/>
+              <w:right w:val="none" w:color="FFFFFF" w:sz="0"/>
+            </w:tcBorders>
+            <w:tcMar>
+              <w:top w:type="dxa" w:w="30"/>
+              <w:left w:type="dxa" w:w="70"/>
+              <w:bottom w:type="dxa" w:w="30"/>
+              <w:right w:type="dxa" w:w="70"/>
+            </w:tcMar>
+            <w:vAlign w:val="center"/>
+          </w:tcPr>
+          <w:p>
+            <w:pPr>
+              <w:keepNext/>
+              <w:spacing w:after="0"/>
+              <w:jc w:val="left"/>
+            </w:pPr>
+            <w:r>
+              <w:rPr>
+                <w:rFonts w:ascii="Times New Roman" w:cs="Times New Roman" w:eastAsia="Times New Roman" w:hAnsi="Times New Roman"/>
+                <w:color w:val="000000"/>
+                <w:sz w:val="18"/>
+                <w:szCs w:val="18"/>
+              </w:rPr>
+              <w:t xml:space="preserve">Perishables inflation, past 4 weeks</w:t>
+            </w:r>
+          </w:p>
+        </w:tc>
+        <w:tc>
+          <w:tcPr>
+            <w:tcW w:type="dxa" w:w="1300"/>
+            <w:tcBorders>
+              <w:top w:val="none" w:color="FFFFFF" w:sz="0"/>
+              <w:left w:val="none" w:color="FFFFFF" w:sz="0"/>
+              <w:bottom w:val="none" w:color="FFFFFF" w:sz="0"/>
+              <w:right w:val="none" w:color="FFFFFF" w:sz="0"/>
+            </w:tcBorders>
+            <w:tcMar>
+              <w:top w:type="dxa" w:w="30"/>
+              <w:left w:type="dxa" w:w="70"/>
+              <w:bottom w:type="dxa" w:w="30"/>
+              <w:right w:type="dxa" w:w="70"/>
+            </w:tcMar>
+            <w:vAlign w:val="center"/>
+          </w:tcPr>
+          <w:p>
+            <w:pPr>
+              <w:keepNext/>
+              <w:spacing w:after="0"/>
+              <w:jc w:val="center"/>
+            </w:pPr>
+            <w:r>
+              <w:rPr>
+                <w:rFonts w:ascii="Times New Roman" w:cs="Times New Roman" w:eastAsia="Times New Roman" w:hAnsi="Times New Roman"/>
+                <w:color w:val="000000"/>
+                <w:sz w:val="18"/>
+                <w:szCs w:val="18"/>
+              </w:rPr>
+              <w:t xml:space="preserve">0.023</w:t>
+            </w:r>
+          </w:p>
+        </w:tc>
+        <w:tc>
+          <w:tcPr>
+            <w:tcW w:type="dxa" w:w="4426"/>
+            <w:tcBorders>
+              <w:top w:val="none" w:color="FFFFFF" w:sz="0"/>
+              <w:left w:val="none" w:color="FFFFFF" w:sz="0"/>
+              <w:bottom w:val="none" w:color="FFFFFF" w:sz="0"/>
+              <w:right w:val="none" w:color="FFFFFF" w:sz="0"/>
+            </w:tcBorders>
+            <w:tcMar>
+              <w:top w:type="dxa" w:w="30"/>
+              <w:left w:type="dxa" w:w="70"/>
+              <w:bottom w:type="dxa" w:w="30"/>
+              <w:right w:type="dxa" w:w="70"/>
+            </w:tcMar>
+            <w:vAlign w:val="center"/>
+          </w:tcPr>
+          <w:p>
+            <w:pPr>
+              <w:keepNext/>
+              <w:spacing w:after="0"/>
+              <w:jc w:val="left"/>
+            </w:pPr>
+            <w:r>
+              <w:rPr>
+                <w:rFonts w:ascii="Times New Roman" w:cs="Times New Roman" w:eastAsia="Times New Roman" w:hAnsi="Times New Roman"/>
+                <w:color w:val="000000"/>
+                <w:sz w:val="18"/>
+                <w:szCs w:val="18"/>
+              </w:rPr>
+              <w:t xml:space="preserve">Track weekly prices of perishables (tomatoes, onions, chicken): food shocks widen the inflation gap against the poorest (H3).</w:t>
+            </w:r>
+          </w:p>
+        </w:tc>
+      </w:tr>
+      <w:tr>
+        <w:trPr>
+          <w:cantSplit/>
+        </w:trPr>
+        <w:tc>
+          <w:tcPr>
+            <w:tcW w:type="dxa" w:w="700"/>
+            <w:tcBorders>
+              <w:top w:val="none" w:color="FFFFFF" w:sz="0"/>
+              <w:left w:val="none" w:color="FFFFFF" w:sz="0"/>
+              <w:bottom w:val="none" w:color="FFFFFF" w:sz="0"/>
+              <w:right w:val="none" w:color="FFFFFF" w:sz="0"/>
+            </w:tcBorders>
+            <w:tcMar>
+              <w:top w:type="dxa" w:w="30"/>
+              <w:left w:type="dxa" w:w="70"/>
+              <w:bottom w:type="dxa" w:w="30"/>
+              <w:right w:type="dxa" w:w="70"/>
+            </w:tcMar>
+            <w:vAlign w:val="center"/>
+          </w:tcPr>
+          <w:p>
+            <w:pPr>
+              <w:keepNext/>
+              <w:spacing w:after="0"/>
+              <w:jc w:val="center"/>
+            </w:pPr>
+            <w:r>
+              <w:rPr>
+                <w:rFonts w:ascii="Times New Roman" w:cs="Times New Roman" w:eastAsia="Times New Roman" w:hAnsi="Times New Roman"/>
+                <w:color w:val="000000"/>
+                <w:sz w:val="18"/>
+                <w:szCs w:val="18"/>
+              </w:rPr>
+              <w:t xml:space="preserve">2</w:t>
+            </w:r>
+          </w:p>
+        </w:tc>
+        <w:tc>
+          <w:tcPr>
+            <w:tcW w:type="dxa" w:w="2600"/>
+            <w:tcBorders>
+              <w:top w:val="none" w:color="FFFFFF" w:sz="0"/>
+              <w:left w:val="none" w:color="FFFFFF" w:sz="0"/>
+              <w:bottom w:val="none" w:color="FFFFFF" w:sz="0"/>
+              <w:right w:val="none" w:color="FFFFFF" w:sz="0"/>
+            </w:tcBorders>
+            <w:tcMar>
+              <w:top w:type="dxa" w:w="30"/>
+              <w:left w:type="dxa" w:w="70"/>
+              <w:bottom w:type="dxa" w:w="30"/>
+              <w:right w:type="dxa" w:w="70"/>
+            </w:tcMar>
+            <w:vAlign w:val="center"/>
+          </w:tcPr>
+          <w:p>
+            <w:pPr>
+              <w:keepNext/>
+              <w:spacing w:after="0"/>
+              <w:jc w:val="left"/>
+            </w:pPr>
+            <w:r>
+              <w:rPr>
+                <w:rFonts w:ascii="Times New Roman" w:cs="Times New Roman" w:eastAsia="Times New Roman" w:hAnsi="Times New Roman"/>
+                <w:color w:val="000000"/>
+                <w:sz w:val="18"/>
+                <w:szCs w:val="18"/>
+              </w:rPr>
+              <w:t xml:space="preserve">Shock weeks in past 4 weeks</w:t>
+            </w:r>
+          </w:p>
+        </w:tc>
+        <w:tc>
+          <w:tcPr>
+            <w:tcW w:type="dxa" w:w="1300"/>
+            <w:tcBorders>
+              <w:top w:val="none" w:color="FFFFFF" w:sz="0"/>
+              <w:left w:val="none" w:color="FFFFFF" w:sz="0"/>
+              <w:bottom w:val="none" w:color="FFFFFF" w:sz="0"/>
+              <w:right w:val="none" w:color="FFFFFF" w:sz="0"/>
+            </w:tcBorders>
+            <w:tcMar>
+              <w:top w:type="dxa" w:w="30"/>
+              <w:left w:type="dxa" w:w="70"/>
+              <w:bottom w:type="dxa" w:w="30"/>
+              <w:right w:type="dxa" w:w="70"/>
+            </w:tcMar>
+            <w:vAlign w:val="center"/>
+          </w:tcPr>
+          <w:p>
+            <w:pPr>
+              <w:keepNext/>
+              <w:spacing w:after="0"/>
+              <w:jc w:val="center"/>
+            </w:pPr>
+            <w:r>
+              <w:rPr>
+                <w:rFonts w:ascii="Times New Roman" w:cs="Times New Roman" w:eastAsia="Times New Roman" w:hAnsi="Times New Roman"/>
+                <w:color w:val="000000"/>
+                <w:sz w:val="18"/>
+                <w:szCs w:val="18"/>
+              </w:rPr>
+              <w:t xml:space="preserve">0.021</w:t>
+            </w:r>
+          </w:p>
+        </w:tc>
+        <w:tc>
+          <w:tcPr>
+            <w:tcW w:type="dxa" w:w="4426"/>
+            <w:tcBorders>
+              <w:top w:val="none" w:color="FFFFFF" w:sz="0"/>
+              <w:left w:val="none" w:color="FFFFFF" w:sz="0"/>
+              <w:bottom w:val="none" w:color="FFFFFF" w:sz="0"/>
+              <w:right w:val="none" w:color="FFFFFF" w:sz="0"/>
+            </w:tcBorders>
+            <w:tcMar>
+              <w:top w:type="dxa" w:w="30"/>
+              <w:left w:type="dxa" w:w="70"/>
+              <w:bottom w:type="dxa" w:w="30"/>
+              <w:right w:type="dxa" w:w="70"/>
+            </w:tcMar>
+            <w:vAlign w:val="center"/>
+          </w:tcPr>
+          <w:p>
+            <w:pPr>
+              <w:keepNext/>
+              <w:spacing w:after="0"/>
+              <w:jc w:val="left"/>
+            </w:pPr>
+            <w:r>
+              <w:rPr>
+                <w:rFonts w:ascii="Times New Roman" w:cs="Times New Roman" w:eastAsia="Times New Roman" w:hAnsi="Times New Roman"/>
+                <w:color w:val="000000"/>
+                <w:sz w:val="18"/>
+                <w:szCs w:val="18"/>
+              </w:rPr>
+              <w:t xml:space="preserve">Shocks cluster: after a first shock week, keep BISP top-ups on standby for the following month.</w:t>
+            </w:r>
+          </w:p>
+        </w:tc>
+      </w:tr>
+      <w:tr>
+        <w:trPr>
+          <w:cantSplit/>
+        </w:trPr>
+        <w:tc>
+          <w:tcPr>
+            <w:tcW w:type="dxa" w:w="700"/>
+            <w:tcBorders>
+              <w:top w:val="none" w:color="FFFFFF" w:sz="0"/>
+              <w:left w:val="none" w:color="FFFFFF" w:sz="0"/>
+              <w:bottom w:val="none" w:color="FFFFFF" w:sz="0"/>
+              <w:right w:val="none" w:color="FFFFFF" w:sz="0"/>
+            </w:tcBorders>
+            <w:tcMar>
+              <w:top w:type="dxa" w:w="30"/>
+              <w:left w:type="dxa" w:w="70"/>
+              <w:bottom w:type="dxa" w:w="30"/>
+              <w:right w:type="dxa" w:w="70"/>
+            </w:tcMar>
+            <w:vAlign w:val="center"/>
+          </w:tcPr>
+          <w:p>
+            <w:pPr>
+              <w:keepNext/>
+              <w:spacing w:after="0"/>
+              <w:jc w:val="center"/>
+            </w:pPr>
+            <w:r>
+              <w:rPr>
+                <w:rFonts w:ascii="Times New Roman" w:cs="Times New Roman" w:eastAsia="Times New Roman" w:hAnsi="Times New Roman"/>
+                <w:color w:val="000000"/>
+                <w:sz w:val="18"/>
+                <w:szCs w:val="18"/>
+              </w:rPr>
+              <w:t xml:space="preserve">3</w:t>
+            </w:r>
+          </w:p>
+        </w:tc>
+        <w:tc>
+          <w:tcPr>
+            <w:tcW w:type="dxa" w:w="2600"/>
+            <w:tcBorders>
+              <w:top w:val="none" w:color="FFFFFF" w:sz="0"/>
+              <w:left w:val="none" w:color="FFFFFF" w:sz="0"/>
+              <w:bottom w:val="none" w:color="FFFFFF" w:sz="0"/>
+              <w:right w:val="none" w:color="FFFFFF" w:sz="0"/>
+            </w:tcBorders>
+            <w:tcMar>
+              <w:top w:type="dxa" w:w="30"/>
+              <w:left w:type="dxa" w:w="70"/>
+              <w:bottom w:type="dxa" w:w="30"/>
+              <w:right w:type="dxa" w:w="70"/>
+            </w:tcMar>
+            <w:vAlign w:val="center"/>
+          </w:tcPr>
+          <w:p>
+            <w:pPr>
+              <w:keepNext/>
+              <w:spacing w:after="0"/>
+              <w:jc w:val="left"/>
+            </w:pPr>
+            <w:r>
+              <w:rPr>
+                <w:rFonts w:ascii="Times New Roman" w:cs="Times New Roman" w:eastAsia="Times New Roman" w:hAnsi="Times New Roman"/>
+                <w:color w:val="000000"/>
+                <w:sz w:val="18"/>
+                <w:szCs w:val="18"/>
+              </w:rPr>
+              <w:t xml:space="preserve">SPI change, past 4 weeks</w:t>
+            </w:r>
+          </w:p>
+        </w:tc>
+        <w:tc>
+          <w:tcPr>
+            <w:tcW w:type="dxa" w:w="1300"/>
+            <w:tcBorders>
+              <w:top w:val="none" w:color="FFFFFF" w:sz="0"/>
+              <w:left w:val="none" w:color="FFFFFF" w:sz="0"/>
+              <w:bottom w:val="none" w:color="FFFFFF" w:sz="0"/>
+              <w:right w:val="none" w:color="FFFFFF" w:sz="0"/>
+            </w:tcBorders>
+            <w:tcMar>
+              <w:top w:type="dxa" w:w="30"/>
+              <w:left w:type="dxa" w:w="70"/>
+              <w:bottom w:type="dxa" w:w="30"/>
+              <w:right w:type="dxa" w:w="70"/>
+            </w:tcMar>
+            <w:vAlign w:val="center"/>
+          </w:tcPr>
+          <w:p>
+            <w:pPr>
+              <w:keepNext/>
+              <w:spacing w:after="0"/>
+              <w:jc w:val="center"/>
+            </w:pPr>
+            <w:r>
+              <w:rPr>
+                <w:rFonts w:ascii="Times New Roman" w:cs="Times New Roman" w:eastAsia="Times New Roman" w:hAnsi="Times New Roman"/>
+                <w:color w:val="000000"/>
+                <w:sz w:val="18"/>
+                <w:szCs w:val="18"/>
+              </w:rPr>
+              <w:t xml:space="preserve">0.020</w:t>
+            </w:r>
+          </w:p>
+        </w:tc>
+        <w:tc>
+          <w:tcPr>
+            <w:tcW w:type="dxa" w:w="4426"/>
+            <w:tcBorders>
+              <w:top w:val="none" w:color="FFFFFF" w:sz="0"/>
+              <w:left w:val="none" w:color="FFFFFF" w:sz="0"/>
+              <w:bottom w:val="none" w:color="FFFFFF" w:sz="0"/>
+              <w:right w:val="none" w:color="FFFFFF" w:sz="0"/>
+            </w:tcBorders>
+            <w:tcMar>
+              <w:top w:type="dxa" w:w="30"/>
+              <w:left w:type="dxa" w:w="70"/>
+              <w:bottom w:type="dxa" w:w="30"/>
+              <w:right w:type="dxa" w:w="70"/>
+            </w:tcMar>
+            <w:vAlign w:val="center"/>
+          </w:tcPr>
+          <w:p>
+            <w:pPr>
+              <w:keepNext/>
+              <w:spacing w:after="0"/>
+              <w:jc w:val="left"/>
+            </w:pPr>
+            <w:r>
+              <w:rPr>
+                <w:rFonts w:ascii="Times New Roman" w:cs="Times New Roman" w:eastAsia="Times New Roman" w:hAnsi="Times New Roman"/>
+                <w:color w:val="000000"/>
+                <w:sz w:val="18"/>
+                <w:szCs w:val="18"/>
+              </w:rPr>
+              <w:t xml:space="preserve">Monitor each quintile's own four-week inflation, not only the weekly change.</w:t>
+            </w:r>
+          </w:p>
+        </w:tc>
+      </w:tr>
+      <w:tr>
+        <w:trPr>
+          <w:cantSplit/>
+        </w:trPr>
+        <w:tc>
+          <w:tcPr>
+            <w:tcW w:type="dxa" w:w="700"/>
+            <w:tcBorders>
+              <w:top w:val="none" w:color="FFFFFF" w:sz="0"/>
+              <w:left w:val="none" w:color="FFFFFF" w:sz="0"/>
+              <w:bottom w:val="none" w:color="FFFFFF" w:sz="0"/>
+              <w:right w:val="none" w:color="FFFFFF" w:sz="0"/>
+            </w:tcBorders>
+            <w:tcMar>
+              <w:top w:type="dxa" w:w="30"/>
+              <w:left w:type="dxa" w:w="70"/>
+              <w:bottom w:type="dxa" w:w="30"/>
+              <w:right w:type="dxa" w:w="70"/>
+            </w:tcMar>
+            <w:vAlign w:val="center"/>
+          </w:tcPr>
+          <w:p>
+            <w:pPr>
+              <w:keepNext/>
+              <w:spacing w:after="0"/>
+              <w:jc w:val="center"/>
+            </w:pPr>
+            <w:r>
+              <w:rPr>
+                <w:rFonts w:ascii="Times New Roman" w:cs="Times New Roman" w:eastAsia="Times New Roman" w:hAnsi="Times New Roman"/>
+                <w:color w:val="000000"/>
+                <w:sz w:val="18"/>
+                <w:szCs w:val="18"/>
+              </w:rPr>
+              <w:t xml:space="preserve">4</w:t>
+            </w:r>
+          </w:p>
+        </w:tc>
+        <w:tc>
+          <w:tcPr>
+            <w:tcW w:type="dxa" w:w="2600"/>
+            <w:tcBorders>
+              <w:top w:val="none" w:color="FFFFFF" w:sz="0"/>
+              <w:left w:val="none" w:color="FFFFFF" w:sz="0"/>
+              <w:bottom w:val="none" w:color="FFFFFF" w:sz="0"/>
+              <w:right w:val="none" w:color="FFFFFF" w:sz="0"/>
+            </w:tcBorders>
+            <w:tcMar>
+              <w:top w:type="dxa" w:w="30"/>
+              <w:left w:type="dxa" w:w="70"/>
+              <w:bottom w:type="dxa" w:w="30"/>
+              <w:right w:type="dxa" w:w="70"/>
+            </w:tcMar>
+            <w:vAlign w:val="center"/>
+          </w:tcPr>
+          <w:p>
+            <w:pPr>
+              <w:keepNext/>
+              <w:spacing w:after="0"/>
+              <w:jc w:val="left"/>
+            </w:pPr>
+            <w:r>
+              <w:rPr>
+                <w:rFonts w:ascii="Times New Roman" w:cs="Times New Roman" w:eastAsia="Times New Roman" w:hAnsi="Times New Roman"/>
+                <w:color w:val="000000"/>
+                <w:sz w:val="18"/>
+                <w:szCs w:val="18"/>
+              </w:rPr>
+              <w:t xml:space="preserve">Rupee change, past 8 weeks</w:t>
+            </w:r>
+          </w:p>
+        </w:tc>
+        <w:tc>
+          <w:tcPr>
+            <w:tcW w:type="dxa" w:w="1300"/>
+            <w:tcBorders>
+              <w:top w:val="none" w:color="FFFFFF" w:sz="0"/>
+              <w:left w:val="none" w:color="FFFFFF" w:sz="0"/>
+              <w:bottom w:val="none" w:color="FFFFFF" w:sz="0"/>
+              <w:right w:val="none" w:color="FFFFFF" w:sz="0"/>
+            </w:tcBorders>
+            <w:tcMar>
+              <w:top w:type="dxa" w:w="30"/>
+              <w:left w:type="dxa" w:w="70"/>
+              <w:bottom w:type="dxa" w:w="30"/>
+              <w:right w:type="dxa" w:w="70"/>
+            </w:tcMar>
+            <w:vAlign w:val="center"/>
+          </w:tcPr>
+          <w:p>
+            <w:pPr>
+              <w:keepNext/>
+              <w:spacing w:after="0"/>
+              <w:jc w:val="center"/>
+            </w:pPr>
+            <w:r>
+              <w:rPr>
+                <w:rFonts w:ascii="Times New Roman" w:cs="Times New Roman" w:eastAsia="Times New Roman" w:hAnsi="Times New Roman"/>
+                <w:color w:val="000000"/>
+                <w:sz w:val="18"/>
+                <w:szCs w:val="18"/>
+              </w:rPr>
+              <w:t xml:space="preserve">0.018</w:t>
+            </w:r>
+          </w:p>
+        </w:tc>
+        <w:tc>
+          <w:tcPr>
+            <w:tcW w:type="dxa" w:w="4426"/>
+            <w:tcBorders>
+              <w:top w:val="none" w:color="FFFFFF" w:sz="0"/>
+              <w:left w:val="none" w:color="FFFFFF" w:sz="0"/>
+              <w:bottom w:val="none" w:color="FFFFFF" w:sz="0"/>
+              <w:right w:val="none" w:color="FFFFFF" w:sz="0"/>
+            </w:tcBorders>
+            <w:tcMar>
+              <w:top w:type="dxa" w:w="30"/>
+              <w:left w:type="dxa" w:w="70"/>
+              <w:bottom w:type="dxa" w:w="30"/>
+              <w:right w:type="dxa" w:w="70"/>
+            </w:tcMar>
+            <w:vAlign w:val="center"/>
+          </w:tcPr>
+          <w:p>
+            <w:pPr>
+              <w:keepNext/>
+              <w:spacing w:after="0"/>
+              <w:jc w:val="left"/>
+            </w:pPr>
+            <w:r>
+              <w:rPr>
+                <w:rFonts w:ascii="Times New Roman" w:cs="Times New Roman" w:eastAsia="Times New Roman" w:hAnsi="Times New Roman"/>
+                <w:color w:val="000000"/>
+                <w:sz w:val="18"/>
+                <w:szCs w:val="18"/>
+              </w:rPr>
+              <w:t xml:space="preserve">A fall of several percent over two months should trigger a readiness review of top-ups; it raises every quintile's prices alike (H2).</w:t>
+            </w:r>
+          </w:p>
+        </w:tc>
+      </w:tr>
+      <w:tr>
+        <w:trPr>
+          <w:cantSplit/>
+        </w:trPr>
+        <w:tc>
+          <w:tcPr>
+            <w:tcW w:type="dxa" w:w="700"/>
+            <w:tcBorders>
+              <w:top w:val="none" w:color="FFFFFF" w:sz="0"/>
+              <w:left w:val="none" w:color="FFFFFF" w:sz="0"/>
+              <w:bottom w:val="single" w:color="000000" w:sz="12"/>
+              <w:right w:val="none" w:color="FFFFFF" w:sz="0"/>
+            </w:tcBorders>
+            <w:tcMar>
+              <w:top w:type="dxa" w:w="30"/>
+              <w:left w:type="dxa" w:w="70"/>
+              <w:bottom w:type="dxa" w:w="30"/>
+              <w:right w:type="dxa" w:w="70"/>
+            </w:tcMar>
+            <w:vAlign w:val="center"/>
+          </w:tcPr>
+          <w:p>
+            <w:pPr>
+              <w:keepNext/>
+              <w:spacing w:after="0"/>
+              <w:jc w:val="center"/>
+            </w:pPr>
+            <w:r>
+              <w:rPr>
+                <w:rFonts w:ascii="Times New Roman" w:cs="Times New Roman" w:eastAsia="Times New Roman" w:hAnsi="Times New Roman"/>
+                <w:color w:val="000000"/>
+                <w:sz w:val="18"/>
+                <w:szCs w:val="18"/>
+              </w:rPr>
+              <w:t xml:space="preserve">5</w:t>
+            </w:r>
+          </w:p>
+        </w:tc>
+        <w:tc>
+          <w:tcPr>
+            <w:tcW w:type="dxa" w:w="2600"/>
+            <w:tcBorders>
+              <w:top w:val="none" w:color="FFFFFF" w:sz="0"/>
+              <w:left w:val="none" w:color="FFFFFF" w:sz="0"/>
+              <w:bottom w:val="single" w:color="000000" w:sz="12"/>
+              <w:right w:val="none" w:color="FFFFFF" w:sz="0"/>
+            </w:tcBorders>
+            <w:tcMar>
+              <w:top w:type="dxa" w:w="30"/>
+              <w:left w:type="dxa" w:w="70"/>
+              <w:bottom w:type="dxa" w:w="30"/>
+              <w:right w:type="dxa" w:w="70"/>
+            </w:tcMar>
+            <w:vAlign w:val="center"/>
+          </w:tcPr>
+          <w:p>
+            <w:pPr>
+              <w:keepNext/>
+              <w:spacing w:after="0"/>
+              <w:jc w:val="left"/>
+            </w:pPr>
+            <w:r>
+              <w:rPr>
+                <w:rFonts w:ascii="Times New Roman" w:cs="Times New Roman" w:eastAsia="Times New Roman" w:hAnsi="Times New Roman"/>
+                <w:color w:val="000000"/>
+                <w:sz w:val="18"/>
+                <w:szCs w:val="18"/>
+              </w:rPr>
+              <w:t xml:space="preserve">Motor-fuel inflation, past 4 weeks</w:t>
+            </w:r>
+          </w:p>
+        </w:tc>
+        <w:tc>
+          <w:tcPr>
+            <w:tcW w:type="dxa" w:w="1300"/>
+            <w:tcBorders>
+              <w:top w:val="none" w:color="FFFFFF" w:sz="0"/>
+              <w:left w:val="none" w:color="FFFFFF" w:sz="0"/>
+              <w:bottom w:val="single" w:color="000000" w:sz="12"/>
+              <w:right w:val="none" w:color="FFFFFF" w:sz="0"/>
+            </w:tcBorders>
+            <w:tcMar>
+              <w:top w:type="dxa" w:w="30"/>
+              <w:left w:type="dxa" w:w="70"/>
+              <w:bottom w:type="dxa" w:w="30"/>
+              <w:right w:type="dxa" w:w="70"/>
+            </w:tcMar>
+            <w:vAlign w:val="center"/>
+          </w:tcPr>
+          <w:p>
+            <w:pPr>
+              <w:keepNext/>
+              <w:spacing w:after="0"/>
+              <w:jc w:val="center"/>
+            </w:pPr>
+            <w:r>
+              <w:rPr>
+                <w:rFonts w:ascii="Times New Roman" w:cs="Times New Roman" w:eastAsia="Times New Roman" w:hAnsi="Times New Roman"/>
+                <w:color w:val="000000"/>
+                <w:sz w:val="18"/>
+                <w:szCs w:val="18"/>
+              </w:rPr>
+              <w:t xml:space="preserve">0.011</w:t>
+            </w:r>
+          </w:p>
+        </w:tc>
+        <w:tc>
+          <w:tcPr>
+            <w:tcW w:type="dxa" w:w="4426"/>
+            <w:tcBorders>
+              <w:top w:val="none" w:color="FFFFFF" w:sz="0"/>
+              <w:left w:val="none" w:color="FFFFFF" w:sz="0"/>
+              <w:bottom w:val="single" w:color="000000" w:sz="12"/>
+              <w:right w:val="none" w:color="FFFFFF" w:sz="0"/>
+            </w:tcBorders>
+            <w:tcMar>
+              <w:top w:type="dxa" w:w="30"/>
+              <w:left w:type="dxa" w:w="70"/>
+              <w:bottom w:type="dxa" w:w="30"/>
+              <w:right w:type="dxa" w:w="70"/>
+            </w:tcMar>
+            <w:vAlign w:val="center"/>
+          </w:tcPr>
+          <w:p>
+            <w:pPr>
+              <w:keepNext/>
+              <w:spacing w:after="0"/>
+              <w:jc w:val="left"/>
+            </w:pPr>
+            <w:r>
+              <w:rPr>
+                <w:rFonts w:ascii="Times New Roman" w:cs="Times New Roman" w:eastAsia="Times New Roman" w:hAnsi="Times New Roman"/>
+                <w:color w:val="000000"/>
+                <w:sz w:val="18"/>
+                <w:szCs w:val="18"/>
+              </w:rPr>
+              <w:t xml:space="preserve">Fuel prices are reviewed fortnightly on known dates, so this signal can be anticipated; its direct burden falls mostly on richer households (H3).</w:t>
+            </w:r>
+          </w:p>
+        </w:tc>
+      </w:tr>
+    </w:tbl>
+    <w:p>
+      <w:pPr>
+        <w:spacing w:after="200" w:before="60"/>
+        <w:jc w:val="both"/>
+      </w:pPr>
+      <w:r>
+        <w:rPr>
+          <w:rFonts w:ascii="Times New Roman" w:cs="Times New Roman" w:eastAsia="Times New Roman" w:hAnsi="Times New Roman"/>
+          <w:color w:val="000000"/>
+          <w:sz w:val="18"/>
+          <w:szCs w:val="18"/>
+        </w:rPr>
+        <w:t xml:space="preserve">Permutation ΔAUC: mean drop in validation AUC when the feature is shuffled, averaged over the three models and four folds (as in Table 22).</w:t>
       </w:r>
     </w:p>
     <w:p>

</xml_diff>